<commit_message>
docs(pwa): atualizar documentação técnica, guia do usuário e página de Ajuda com PWA-01
- technical-documentation.md: nova seção PWA com manifesto, SW, push notifications,
  tabela push_subscriptions, API routes, variáveis de ambiente, hook e componentes
- user-guide.md: seções "Instalando o app no seu dispositivo" e "Lembretes de revisão
  (Notificações Push)" com instruções para Android, iOS e desktop
- HelpView.tsx: novo módulo "App Instalável + Notificações" no accordion da Central de Ajuda
- DOCX e PDF regenerados para todas as docs

Co-Authored-By: Claude Sonnet 4.6 <noreply@anthropic.com>
</commit_message>
<xml_diff>
--- a/docs/technical-documentation/technical-documentation.docx
+++ b/docs/technical-documentation/technical-documentation.docx
@@ -7105,6 +7105,1943 @@
           <w:szCs w:val="20"/>
         </w:rPr>
         <w:t xml:space="preserve">auth.admin.deleteUser</w:t>
+      </w:r>
+    </w:p>
+    <w:p>
+      <w:pPr>
+        <w:spacing w:after="80" w:before="80"/>
+      </w:pPr>
+    </w:p>
+    <w:p>
+      <w:pPr>
+        <w:pBdr>
+          <w:bottom w:color="E2E8F0" w:sz="4" w:space="1"/>
+        </w:pBdr>
+        <w:spacing w:after="200" w:before="200"/>
+      </w:pPr>
+    </w:p>
+    <w:p>
+      <w:pPr>
+        <w:spacing w:after="80" w:before="80"/>
+      </w:pPr>
+    </w:p>
+    <w:p>
+      <w:pPr>
+        <w:pStyle w:val="Heading2"/>
+        <w:spacing w:after="160" w:before="360"/>
+      </w:pPr>
+      <w:r>
+        <w:rPr>
+          <w:rFonts w:ascii="Calibri" w:cs="Calibri" w:eastAsia="Calibri" w:hAnsi="Calibri"/>
+          <w:b/>
+          <w:bCs/>
+          <w:color w:val="0891B2"/>
+          <w:sz w:val="28"/>
+          <w:szCs w:val="28"/>
+        </w:rPr>
+        <w:t xml:space="preserve">Progressive Web App (PWA)</w:t>
+      </w:r>
+    </w:p>
+    <w:p>
+      <w:pPr>
+        <w:spacing w:after="80" w:before="80"/>
+      </w:pPr>
+    </w:p>
+    <w:p>
+      <w:pPr>
+        <w:pStyle w:val="Heading3"/>
+        <w:spacing w:after="120" w:before="240"/>
+      </w:pPr>
+      <w:r>
+        <w:rPr>
+          <w:rFonts w:ascii="Calibri" w:cs="Calibri" w:eastAsia="Calibri" w:hAnsi="Calibri"/>
+          <w:b/>
+          <w:bCs/>
+          <w:color w:val="1E293B"/>
+          <w:sz w:val="24"/>
+          <w:szCs w:val="24"/>
+        </w:rPr>
+        <w:t xml:space="preserve">Visão Geral</w:t>
+      </w:r>
+    </w:p>
+    <w:p>
+      <w:pPr>
+        <w:spacing w:after="80" w:before="80"/>
+      </w:pPr>
+    </w:p>
+    <w:p>
+      <w:pPr>
+        <w:spacing w:after="80" w:before="80"/>
+      </w:pPr>
+      <w:r>
+        <w:rPr>
+          <w:rFonts w:ascii="Calibri" w:cs="Calibri" w:eastAsia="Calibri" w:hAnsi="Calibri"/>
+          <w:color w:val="1E293B"/>
+          <w:sz w:val="22"/>
+          <w:szCs w:val="22"/>
+        </w:rPr>
+        <w:t xml:space="preserve">O NeuroLearn é instalável como PWA em Android, iOS (Safari) e desktop (Chrome/Edge). A implementação usa Service Worker nativo sem </w:t>
+      </w:r>
+      <w:r>
+        <w:rPr>
+          <w:rFonts w:ascii="Courier New" w:cs="Courier New" w:eastAsia="Courier New" w:hAnsi="Courier New"/>
+          <w:color w:val="7C3AED"/>
+          <w:sz w:val="20"/>
+          <w:szCs w:val="20"/>
+        </w:rPr>
+        <w:t xml:space="preserve">next-pwa</w:t>
+      </w:r>
+      <w:r>
+        <w:rPr>
+          <w:rFonts w:ascii="Calibri" w:cs="Calibri" w:eastAsia="Calibri" w:hAnsi="Calibri"/>
+          <w:color w:val="1E293B"/>
+          <w:sz w:val="22"/>
+          <w:szCs w:val="22"/>
+        </w:rPr>
+        <w:t xml:space="preserve"> para evitar conflito com o webpack do </w:t>
+      </w:r>
+      <w:r>
+        <w:rPr>
+          <w:rFonts w:ascii="Courier New" w:cs="Courier New" w:eastAsia="Courier New" w:hAnsi="Courier New"/>
+          <w:color w:val="7C3AED"/>
+          <w:sz w:val="20"/>
+          <w:szCs w:val="20"/>
+        </w:rPr>
+        <w:t xml:space="preserve">@sentry/nextjs</w:t>
+      </w:r>
+      <w:r>
+        <w:rPr>
+          <w:rFonts w:ascii="Calibri" w:cs="Calibri" w:eastAsia="Calibri" w:hAnsi="Calibri"/>
+          <w:color w:val="1E293B"/>
+          <w:sz w:val="22"/>
+          <w:szCs w:val="22"/>
+        </w:rPr>
+        <w:t xml:space="preserve">.</w:t>
+      </w:r>
+    </w:p>
+    <w:p>
+      <w:pPr>
+        <w:spacing w:after="80" w:before="80"/>
+      </w:pPr>
+    </w:p>
+    <w:p>
+      <w:pPr>
+        <w:pStyle w:val="Heading3"/>
+        <w:spacing w:after="120" w:before="240"/>
+      </w:pPr>
+      <w:r>
+        <w:rPr>
+          <w:rFonts w:ascii="Calibri" w:cs="Calibri" w:eastAsia="Calibri" w:hAnsi="Calibri"/>
+          <w:b/>
+          <w:bCs/>
+          <w:color w:val="1E293B"/>
+          <w:sz w:val="24"/>
+          <w:szCs w:val="24"/>
+        </w:rPr>
+        <w:t xml:space="preserve">Manifesto (`public/manifest.webmanifest`)</w:t>
+      </w:r>
+    </w:p>
+    <w:p>
+      <w:pPr>
+        <w:spacing w:after="80" w:before="80"/>
+      </w:pPr>
+    </w:p>
+    <w:p>
+      <w:pPr>
+        <w:shd w:fill="F1F5F9" w:color="F1F5F9" w:val="solid"/>
+        <w:spacing w:after="200" w:before="200"/>
+        <w:ind w:left="431"/>
+      </w:pPr>
+      <w:r>
+        <w:rPr>
+          <w:rFonts w:ascii="Courier New" w:cs="Courier New" w:eastAsia="Courier New" w:hAnsi="Courier New"/>
+          <w:color w:val="1E293B"/>
+          <w:sz w:val="18"/>
+          <w:szCs w:val="18"/>
+        </w:rPr>
+        <w:t xml:space="preserve">{
+  "name": "NeuroLearn",
+  "short_name": "NeuroLearn",
+  "start_url": "/dashboard",
+  "display": "standalone",
+  "background_color": "#0a0b0f",
+  "theme_color": "#7c3aed",
+  "icons": [
+    { "src": "/icons/icon-192.png", "sizes": "192x192", "purpose": "any" },
+    { "src": "/icons/icon-512.png", "sizes": "512x512", "purpose": "any" },
+    { "src": "/icons/icon-maskable.png", "sizes": "512x512", "purpose": "maskable" }
+  ],
+  "shortcuts": [
+    { "name": "Revisão diária", "url": "/review" },
+    { "name": "Biblioteca", "url": "/library" }
+  ]
+}</w:t>
+      </w:r>
+    </w:p>
+    <w:p>
+      <w:pPr>
+        <w:spacing w:after="80" w:before="80"/>
+      </w:pPr>
+    </w:p>
+    <w:p>
+      <w:pPr>
+        <w:spacing w:after="80" w:before="80"/>
+      </w:pPr>
+      <w:r>
+        <w:rPr>
+          <w:rFonts w:ascii="Calibri" w:cs="Calibri" w:eastAsia="Calibri" w:hAnsi="Calibri"/>
+          <w:color w:val="1E293B"/>
+          <w:sz w:val="22"/>
+          <w:szCs w:val="22"/>
+        </w:rPr>
+        <w:t xml:space="preserve">Ícones gerados via </w:t>
+      </w:r>
+      <w:r>
+        <w:rPr>
+          <w:rFonts w:ascii="Courier New" w:cs="Courier New" w:eastAsia="Courier New" w:hAnsi="Courier New"/>
+          <w:color w:val="7C3AED"/>
+          <w:sz w:val="20"/>
+          <w:szCs w:val="20"/>
+        </w:rPr>
+        <w:t xml:space="preserve">scripts/generate-icons.js</w:t>
+      </w:r>
+      <w:r>
+        <w:rPr>
+          <w:rFonts w:ascii="Calibri" w:cs="Calibri" w:eastAsia="Calibri" w:hAnsi="Calibri"/>
+          <w:color w:val="1E293B"/>
+          <w:sz w:val="22"/>
+          <w:szCs w:val="22"/>
+        </w:rPr>
+        <w:t xml:space="preserve"> (Node.js puro, sem dependências externas — usa </w:t>
+      </w:r>
+      <w:r>
+        <w:rPr>
+          <w:rFonts w:ascii="Courier New" w:cs="Courier New" w:eastAsia="Courier New" w:hAnsi="Courier New"/>
+          <w:color w:val="7C3AED"/>
+          <w:sz w:val="20"/>
+          <w:szCs w:val="20"/>
+        </w:rPr>
+        <w:t xml:space="preserve">zlib</w:t>
+      </w:r>
+      <w:r>
+        <w:rPr>
+          <w:rFonts w:ascii="Calibri" w:cs="Calibri" w:eastAsia="Calibri" w:hAnsi="Calibri"/>
+          <w:color w:val="1E293B"/>
+          <w:sz w:val="22"/>
+          <w:szCs w:val="22"/>
+        </w:rPr>
+        <w:t xml:space="preserve"> + CRC32 para criar PNGs válidos).</w:t>
+      </w:r>
+    </w:p>
+    <w:p>
+      <w:pPr>
+        <w:spacing w:after="80" w:before="80"/>
+      </w:pPr>
+    </w:p>
+    <w:p>
+      <w:pPr>
+        <w:pStyle w:val="Heading3"/>
+        <w:spacing w:after="120" w:before="240"/>
+      </w:pPr>
+      <w:r>
+        <w:rPr>
+          <w:rFonts w:ascii="Calibri" w:cs="Calibri" w:eastAsia="Calibri" w:hAnsi="Calibri"/>
+          <w:b/>
+          <w:bCs/>
+          <w:color w:val="1E293B"/>
+          <w:sz w:val="24"/>
+          <w:szCs w:val="24"/>
+        </w:rPr>
+        <w:t xml:space="preserve">Service Worker (`public/sw.js`)</w:t>
+      </w:r>
+    </w:p>
+    <w:p>
+      <w:pPr>
+        <w:spacing w:after="80" w:before="80"/>
+      </w:pPr>
+    </w:p>
+    <w:p>
+      <w:pPr>
+        <w:spacing w:after="80" w:before="80"/>
+      </w:pPr>
+      <w:r>
+        <w:rPr>
+          <w:rFonts w:ascii="Calibri" w:cs="Calibri" w:eastAsia="Calibri" w:hAnsi="Calibri"/>
+          <w:color w:val="1E293B"/>
+          <w:sz w:val="22"/>
+          <w:szCs w:val="22"/>
+        </w:rPr>
+        <w:t xml:space="preserve">Estratégias de cache por tipo de recurso:</w:t>
+      </w:r>
+    </w:p>
+    <w:p>
+      <w:pPr>
+        <w:spacing w:after="80" w:before="80"/>
+      </w:pPr>
+    </w:p>
+    <w:tbl>
+      <w:tblPr>
+        <w:tblW w:type="pct" w:w="100%"/>
+        <w:tblBorders>
+          <w:top w:val="single" w:color="auto" w:sz="4"/>
+          <w:left w:val="single" w:color="auto" w:sz="4"/>
+          <w:bottom w:val="single" w:color="auto" w:sz="4"/>
+          <w:right w:val="single" w:color="auto" w:sz="4"/>
+          <w:insideH w:val="single" w:color="auto" w:sz="4"/>
+          <w:insideV w:val="single" w:color="auto" w:sz="4"/>
+        </w:tblBorders>
+        <w:tblCellMar>
+          <w:top w:type="dxa" w:w="100"/>
+          <w:left w:type="dxa" w:w="100"/>
+          <w:bottom w:type="dxa" w:w="100"/>
+          <w:right w:type="dxa" w:w="100"/>
+        </w:tblCellMar>
+      </w:tblPr>
+      <w:tblGrid>
+        <w:gridCol w:w="100"/>
+        <w:gridCol w:w="100"/>
+      </w:tblGrid>
+      <w:tr>
+        <w:tc>
+          <w:tcPr>
+            <w:shd w:fill="7C3AED" w:color="7C3AED" w:val="solid"/>
+          </w:tcPr>
+          <w:p>
+            <w:r>
+              <w:rPr>
+                <w:rFonts w:ascii="Calibri" w:cs="Calibri" w:eastAsia="Calibri" w:hAnsi="Calibri"/>
+                <w:b/>
+                <w:bCs/>
+                <w:color w:val="FFFFFF"/>
+                <w:sz w:val="20"/>
+                <w:szCs w:val="20"/>
+              </w:rPr>
+              <w:t xml:space="preserve">Recurso</w:t>
+            </w:r>
+          </w:p>
+        </w:tc>
+        <w:tc>
+          <w:tcPr>
+            <w:shd w:fill="7C3AED" w:color="7C3AED" w:val="solid"/>
+          </w:tcPr>
+          <w:p>
+            <w:r>
+              <w:rPr>
+                <w:rFonts w:ascii="Calibri" w:cs="Calibri" w:eastAsia="Calibri" w:hAnsi="Calibri"/>
+                <w:b/>
+                <w:bCs/>
+                <w:color w:val="FFFFFF"/>
+                <w:sz w:val="20"/>
+                <w:szCs w:val="20"/>
+              </w:rPr>
+              <w:t xml:space="preserve">Estratégia</w:t>
+            </w:r>
+          </w:p>
+        </w:tc>
+      </w:tr>
+      <w:tr>
+        <w:tc>
+          <w:tcPr>
+            <w:shd/>
+          </w:tcPr>
+          <w:p>
+            <w:r>
+              <w:rPr>
+                <w:rFonts w:ascii="Calibri" w:cs="Calibri" w:eastAsia="Calibri" w:hAnsi="Calibri"/>
+                <w:b w:val="false"/>
+                <w:bCs w:val="false"/>
+                <w:color w:val="1E293B"/>
+                <w:sz w:val="20"/>
+                <w:szCs w:val="20"/>
+              </w:rPr>
+              <w:t xml:space="preserve">`/_next/static/`</w:t>
+            </w:r>
+          </w:p>
+        </w:tc>
+        <w:tc>
+          <w:tcPr>
+            <w:shd/>
+          </w:tcPr>
+          <w:p>
+            <w:r>
+              <w:rPr>
+                <w:rFonts w:ascii="Calibri" w:cs="Calibri" w:eastAsia="Calibri" w:hAnsi="Calibri"/>
+                <w:b w:val="false"/>
+                <w:bCs w:val="false"/>
+                <w:color w:val="1E293B"/>
+                <w:sz w:val="20"/>
+                <w:szCs w:val="20"/>
+              </w:rPr>
+              <w:t xml:space="preserve">Cache First — ativos imutáveis com hash</w:t>
+            </w:r>
+          </w:p>
+        </w:tc>
+      </w:tr>
+      <w:tr>
+        <w:tc>
+          <w:tcPr>
+            <w:shd w:fill="F1F5F9" w:color="F1F5F9" w:val="solid"/>
+          </w:tcPr>
+          <w:p>
+            <w:r>
+              <w:rPr>
+                <w:rFonts w:ascii="Calibri" w:cs="Calibri" w:eastAsia="Calibri" w:hAnsi="Calibri"/>
+                <w:b w:val="false"/>
+                <w:bCs w:val="false"/>
+                <w:color w:val="1E293B"/>
+                <w:sz w:val="20"/>
+                <w:szCs w:val="20"/>
+              </w:rPr>
+              <w:t xml:space="preserve">Páginas HTML</w:t>
+            </w:r>
+          </w:p>
+        </w:tc>
+        <w:tc>
+          <w:tcPr>
+            <w:shd w:fill="F1F5F9" w:color="F1F5F9" w:val="solid"/>
+          </w:tcPr>
+          <w:p>
+            <w:r>
+              <w:rPr>
+                <w:rFonts w:ascii="Calibri" w:cs="Calibri" w:eastAsia="Calibri" w:hAnsi="Calibri"/>
+                <w:b w:val="false"/>
+                <w:bCs w:val="false"/>
+                <w:color w:val="1E293B"/>
+                <w:sz w:val="20"/>
+                <w:szCs w:val="20"/>
+              </w:rPr>
+              <w:t xml:space="preserve">Network First → fallback do cache</w:t>
+            </w:r>
+          </w:p>
+        </w:tc>
+      </w:tr>
+      <w:tr>
+        <w:tc>
+          <w:tcPr>
+            <w:shd/>
+          </w:tcPr>
+          <w:p>
+            <w:r>
+              <w:rPr>
+                <w:rFonts w:ascii="Calibri" w:cs="Calibri" w:eastAsia="Calibri" w:hAnsi="Calibri"/>
+                <w:b w:val="false"/>
+                <w:bCs w:val="false"/>
+                <w:color w:val="1E293B"/>
+                <w:sz w:val="20"/>
+                <w:szCs w:val="20"/>
+              </w:rPr>
+              <w:t xml:space="preserve">`/api/*`</w:t>
+            </w:r>
+          </w:p>
+        </w:tc>
+        <w:tc>
+          <w:tcPr>
+            <w:shd/>
+          </w:tcPr>
+          <w:p>
+            <w:r>
+              <w:rPr>
+                <w:rFonts w:ascii="Calibri" w:cs="Calibri" w:eastAsia="Calibri" w:hAnsi="Calibri"/>
+                <w:b w:val="false"/>
+                <w:bCs w:val="false"/>
+                <w:color w:val="1E293B"/>
+                <w:sz w:val="20"/>
+                <w:szCs w:val="20"/>
+              </w:rPr>
+              <w:t xml:space="preserve">Network Only — nunca cachear respostas de API</w:t>
+            </w:r>
+          </w:p>
+        </w:tc>
+      </w:tr>
+      <w:tr>
+        <w:tc>
+          <w:tcPr>
+            <w:shd w:fill="F1F5F9" w:color="F1F5F9" w:val="solid"/>
+          </w:tcPr>
+          <w:p>
+            <w:r>
+              <w:rPr>
+                <w:rFonts w:ascii="Calibri" w:cs="Calibri" w:eastAsia="Calibri" w:hAnsi="Calibri"/>
+                <w:b w:val="false"/>
+                <w:bCs w:val="false"/>
+                <w:color w:val="1E293B"/>
+                <w:sz w:val="20"/>
+                <w:szCs w:val="20"/>
+              </w:rPr>
+              <w:t xml:space="preserve">Push events</w:t>
+            </w:r>
+          </w:p>
+        </w:tc>
+        <w:tc>
+          <w:tcPr>
+            <w:shd w:fill="F1F5F9" w:color="F1F5F9" w:val="solid"/>
+          </w:tcPr>
+          <w:p>
+            <w:r>
+              <w:rPr>
+                <w:rFonts w:ascii="Calibri" w:cs="Calibri" w:eastAsia="Calibri" w:hAnsi="Calibri"/>
+                <w:b w:val="false"/>
+                <w:bCs w:val="false"/>
+                <w:color w:val="1E293B"/>
+                <w:sz w:val="20"/>
+                <w:szCs w:val="20"/>
+              </w:rPr>
+              <w:t xml:space="preserve">`showNotification` com actions Revisar/Depois</w:t>
+            </w:r>
+          </w:p>
+        </w:tc>
+      </w:tr>
+    </w:tbl>
+    <w:p/>
+    <w:p>
+      <w:pPr>
+        <w:spacing w:after="80" w:before="80"/>
+      </w:pPr>
+    </w:p>
+    <w:p>
+      <w:pPr>
+        <w:spacing w:after="80" w:before="80"/>
+      </w:pPr>
+      <w:r>
+        <w:rPr>
+          <w:rFonts w:ascii="Calibri" w:cs="Calibri" w:eastAsia="Calibri" w:hAnsi="Calibri"/>
+          <w:color w:val="1E293B"/>
+          <w:sz w:val="22"/>
+          <w:szCs w:val="22"/>
+        </w:rPr>
+        <w:t xml:space="preserve">O SW usa </w:t>
+      </w:r>
+      <w:r>
+        <w:rPr>
+          <w:rFonts w:ascii="Courier New" w:cs="Courier New" w:eastAsia="Courier New" w:hAnsi="Courier New"/>
+          <w:color w:val="7C3AED"/>
+          <w:sz w:val="20"/>
+          <w:szCs w:val="20"/>
+        </w:rPr>
+        <w:t xml:space="preserve">skipWaiting()</w:t>
+      </w:r>
+      <w:r>
+        <w:rPr>
+          <w:rFonts w:ascii="Calibri" w:cs="Calibri" w:eastAsia="Calibri" w:hAnsi="Calibri"/>
+          <w:color w:val="1E293B"/>
+          <w:sz w:val="22"/>
+          <w:szCs w:val="22"/>
+        </w:rPr>
+        <w:t xml:space="preserve"> no install e </w:t>
+      </w:r>
+      <w:r>
+        <w:rPr>
+          <w:rFonts w:ascii="Courier New" w:cs="Courier New" w:eastAsia="Courier New" w:hAnsi="Courier New"/>
+          <w:color w:val="7C3AED"/>
+          <w:sz w:val="20"/>
+          <w:szCs w:val="20"/>
+        </w:rPr>
+        <w:t xml:space="preserve">clients.claim()</w:t>
+      </w:r>
+      <w:r>
+        <w:rPr>
+          <w:rFonts w:ascii="Calibri" w:cs="Calibri" w:eastAsia="Calibri" w:hAnsi="Calibri"/>
+          <w:color w:val="1E293B"/>
+          <w:sz w:val="22"/>
+          <w:szCs w:val="22"/>
+        </w:rPr>
+        <w:t xml:space="preserve"> no activate para ativação imediata.</w:t>
+      </w:r>
+    </w:p>
+    <w:p>
+      <w:pPr>
+        <w:spacing w:after="80" w:before="80"/>
+      </w:pPr>
+    </w:p>
+    <w:p>
+      <w:pPr>
+        <w:pStyle w:val="Heading3"/>
+        <w:spacing w:after="120" w:before="240"/>
+      </w:pPr>
+      <w:r>
+        <w:rPr>
+          <w:rFonts w:ascii="Calibri" w:cs="Calibri" w:eastAsia="Calibri" w:hAnsi="Calibri"/>
+          <w:b/>
+          <w:bCs/>
+          <w:color w:val="1E293B"/>
+          <w:sz w:val="24"/>
+          <w:szCs w:val="24"/>
+        </w:rPr>
+        <w:t xml:space="preserve">Push Notifications</w:t>
+      </w:r>
+    </w:p>
+    <w:p>
+      <w:pPr>
+        <w:spacing w:after="80" w:before="80"/>
+      </w:pPr>
+    </w:p>
+    <w:p>
+      <w:pPr>
+        <w:spacing w:after="80" w:before="160"/>
+      </w:pPr>
+      <w:r>
+        <w:rPr>
+          <w:rFonts w:ascii="Calibri" w:cs="Calibri" w:eastAsia="Calibri" w:hAnsi="Calibri"/>
+          <w:b/>
+          <w:bCs/>
+          <w:color w:val="64748B"/>
+          <w:sz w:val="22"/>
+          <w:szCs w:val="22"/>
+        </w:rPr>
+        <w:t xml:space="preserve">Infraestrutura</w:t>
+      </w:r>
+    </w:p>
+    <w:p>
+      <w:pPr>
+        <w:spacing w:after="80" w:before="80"/>
+      </w:pPr>
+    </w:p>
+    <w:p>
+      <w:pPr>
+        <w:pStyle w:val="ListParagraph"/>
+        <w:numPr>
+          <w:ilvl w:val="0"/>
+          <w:numId w:val="1"/>
+        </w:numPr>
+        <w:spacing w:after="60" w:before="60"/>
+        <w:ind w:left="431"/>
+      </w:pPr>
+      <w:r>
+        <w:rPr>
+          <w:rFonts w:ascii="Calibri" w:cs="Calibri" w:eastAsia="Calibri" w:hAnsi="Calibri"/>
+          <w:b/>
+          <w:bCs/>
+          <w:color w:val="1E293B"/>
+          <w:sz w:val="22"/>
+          <w:szCs w:val="22"/>
+        </w:rPr>
+        <w:t xml:space="preserve">Biblioteca:</w:t>
+      </w:r>
+      <w:r>
+        <w:rPr>
+          <w:rFonts w:ascii="Calibri" w:cs="Calibri" w:eastAsia="Calibri" w:hAnsi="Calibri"/>
+          <w:color w:val="1E293B"/>
+          <w:sz w:val="22"/>
+          <w:szCs w:val="22"/>
+        </w:rPr>
+        <w:t xml:space="preserve"> </w:t>
+      </w:r>
+      <w:r>
+        <w:rPr>
+          <w:rFonts w:ascii="Courier New" w:cs="Courier New" w:eastAsia="Courier New" w:hAnsi="Courier New"/>
+          <w:color w:val="7C3AED"/>
+          <w:sz w:val="20"/>
+          <w:szCs w:val="20"/>
+        </w:rPr>
+        <w:t xml:space="preserve">web-push</w:t>
+      </w:r>
+      <w:r>
+        <w:rPr>
+          <w:rFonts w:ascii="Calibri" w:cs="Calibri" w:eastAsia="Calibri" w:hAnsi="Calibri"/>
+          <w:color w:val="1E293B"/>
+          <w:sz w:val="22"/>
+          <w:szCs w:val="22"/>
+        </w:rPr>
+        <w:t xml:space="preserve"> (server-side, Node.js)</w:t>
+      </w:r>
+    </w:p>
+    <w:p>
+      <w:pPr>
+        <w:pStyle w:val="ListParagraph"/>
+        <w:numPr>
+          <w:ilvl w:val="0"/>
+          <w:numId w:val="1"/>
+        </w:numPr>
+        <w:spacing w:after="60" w:before="60"/>
+        <w:ind w:left="431"/>
+      </w:pPr>
+      <w:r>
+        <w:rPr>
+          <w:rFonts w:ascii="Calibri" w:cs="Calibri" w:eastAsia="Calibri" w:hAnsi="Calibri"/>
+          <w:b/>
+          <w:bCs/>
+          <w:color w:val="1E293B"/>
+          <w:sz w:val="22"/>
+          <w:szCs w:val="22"/>
+        </w:rPr>
+        <w:t xml:space="preserve">Protocolo:</w:t>
+      </w:r>
+      <w:r>
+        <w:rPr>
+          <w:rFonts w:ascii="Calibri" w:cs="Calibri" w:eastAsia="Calibri" w:hAnsi="Calibri"/>
+          <w:color w:val="1E293B"/>
+          <w:sz w:val="22"/>
+          <w:szCs w:val="22"/>
+        </w:rPr>
+        <w:t xml:space="preserve"> Web Push Protocol com VAPID</w:t>
+      </w:r>
+    </w:p>
+    <w:p>
+      <w:pPr>
+        <w:pStyle w:val="ListParagraph"/>
+        <w:numPr>
+          <w:ilvl w:val="0"/>
+          <w:numId w:val="1"/>
+        </w:numPr>
+        <w:spacing w:after="60" w:before="60"/>
+        <w:ind w:left="431"/>
+      </w:pPr>
+      <w:r>
+        <w:rPr>
+          <w:rFonts w:ascii="Calibri" w:cs="Calibri" w:eastAsia="Calibri" w:hAnsi="Calibri"/>
+          <w:b/>
+          <w:bCs/>
+          <w:color w:val="1E293B"/>
+          <w:sz w:val="22"/>
+          <w:szCs w:val="22"/>
+        </w:rPr>
+        <w:t xml:space="preserve">Tabela:</w:t>
+      </w:r>
+      <w:r>
+        <w:rPr>
+          <w:rFonts w:ascii="Calibri" w:cs="Calibri" w:eastAsia="Calibri" w:hAnsi="Calibri"/>
+          <w:color w:val="1E293B"/>
+          <w:sz w:val="22"/>
+          <w:szCs w:val="22"/>
+        </w:rPr>
+        <w:t xml:space="preserve"> </w:t>
+      </w:r>
+      <w:r>
+        <w:rPr>
+          <w:rFonts w:ascii="Courier New" w:cs="Courier New" w:eastAsia="Courier New" w:hAnsi="Courier New"/>
+          <w:color w:val="7C3AED"/>
+          <w:sz w:val="20"/>
+          <w:szCs w:val="20"/>
+        </w:rPr>
+        <w:t xml:space="preserve">push_subscriptions</w:t>
+      </w:r>
+      <w:r>
+        <w:rPr>
+          <w:rFonts w:ascii="Calibri" w:cs="Calibri" w:eastAsia="Calibri" w:hAnsi="Calibri"/>
+          <w:color w:val="1E293B"/>
+          <w:sz w:val="22"/>
+          <w:szCs w:val="22"/>
+        </w:rPr>
+        <w:t xml:space="preserve"> no Supabase (RLS: </w:t>
+      </w:r>
+      <w:r>
+        <w:rPr>
+          <w:rFonts w:ascii="Courier New" w:cs="Courier New" w:eastAsia="Courier New" w:hAnsi="Courier New"/>
+          <w:color w:val="7C3AED"/>
+          <w:sz w:val="20"/>
+          <w:szCs w:val="20"/>
+        </w:rPr>
+        <w:t xml:space="preserve">auth.uid() = user_id</w:t>
+      </w:r>
+      <w:r>
+        <w:rPr>
+          <w:rFonts w:ascii="Calibri" w:cs="Calibri" w:eastAsia="Calibri" w:hAnsi="Calibri"/>
+          <w:color w:val="1E293B"/>
+          <w:sz w:val="22"/>
+          <w:szCs w:val="22"/>
+        </w:rPr>
+        <w:t xml:space="preserve">)</w:t>
+      </w:r>
+    </w:p>
+    <w:p>
+      <w:pPr>
+        <w:spacing w:after="80" w:before="80"/>
+      </w:pPr>
+    </w:p>
+    <w:p>
+      <w:pPr>
+        <w:spacing w:after="80" w:before="160"/>
+      </w:pPr>
+      <w:r>
+        <w:rPr>
+          <w:rFonts w:ascii="Calibri" w:cs="Calibri" w:eastAsia="Calibri" w:hAnsi="Calibri"/>
+          <w:b/>
+          <w:bCs/>
+          <w:color w:val="64748B"/>
+          <w:sz w:val="22"/>
+          <w:szCs w:val="22"/>
+        </w:rPr>
+        <w:t xml:space="preserve">Tabela `push_subscriptions`</w:t>
+      </w:r>
+    </w:p>
+    <w:p>
+      <w:pPr>
+        <w:spacing w:after="80" w:before="80"/>
+      </w:pPr>
+    </w:p>
+    <w:p>
+      <w:pPr>
+        <w:shd w:fill="F1F5F9" w:color="F1F5F9" w:val="solid"/>
+        <w:spacing w:after="200" w:before="200"/>
+        <w:ind w:left="431"/>
+      </w:pPr>
+      <w:r>
+        <w:rPr>
+          <w:rFonts w:ascii="Courier New" w:cs="Courier New" w:eastAsia="Courier New" w:hAnsi="Courier New"/>
+          <w:color w:val="1E293B"/>
+          <w:sz w:val="18"/>
+          <w:szCs w:val="18"/>
+        </w:rPr>
+        <w:t xml:space="preserve">CREATE TABLE push_subscriptions (
+  id UUID PRIMARY KEY DEFAULT gen_random_uuid(),
+  user_id UUID NOT NULL REFERENCES auth.users(id) ON DELETE CASCADE,
+  endpoint TEXT NOT NULL,
+  p256dh TEXT NOT NULL,
+  auth TEXT NOT NULL,
+  created_at TIMESTAMPTZ NOT NULL DEFAULT NOW(),
+  UNIQUE (user_id, endpoint)
+);
+ALTER TABLE push_subscriptions ENABLE ROW LEVEL SECURITY;
+CREATE POLICY "users can manage own push subscriptions"
+  ON push_subscriptions FOR ALL
+  USING (auth.uid() = user_id) WITH CHECK (auth.uid() = user_id);</w:t>
+      </w:r>
+    </w:p>
+    <w:p>
+      <w:pPr>
+        <w:spacing w:after="80" w:before="80"/>
+      </w:pPr>
+    </w:p>
+    <w:p>
+      <w:pPr>
+        <w:spacing w:after="80" w:before="160"/>
+      </w:pPr>
+      <w:r>
+        <w:rPr>
+          <w:rFonts w:ascii="Calibri" w:cs="Calibri" w:eastAsia="Calibri" w:hAnsi="Calibri"/>
+          <w:b/>
+          <w:bCs/>
+          <w:color w:val="64748B"/>
+          <w:sz w:val="22"/>
+          <w:szCs w:val="22"/>
+        </w:rPr>
+        <w:t xml:space="preserve">API Routes</w:t>
+      </w:r>
+    </w:p>
+    <w:p>
+      <w:pPr>
+        <w:spacing w:after="80" w:before="80"/>
+      </w:pPr>
+    </w:p>
+    <w:tbl>
+      <w:tblPr>
+        <w:tblW w:type="pct" w:w="100%"/>
+        <w:tblBorders>
+          <w:top w:val="single" w:color="auto" w:sz="4"/>
+          <w:left w:val="single" w:color="auto" w:sz="4"/>
+          <w:bottom w:val="single" w:color="auto" w:sz="4"/>
+          <w:right w:val="single" w:color="auto" w:sz="4"/>
+          <w:insideH w:val="single" w:color="auto" w:sz="4"/>
+          <w:insideV w:val="single" w:color="auto" w:sz="4"/>
+        </w:tblBorders>
+        <w:tblCellMar>
+          <w:top w:type="dxa" w:w="100"/>
+          <w:left w:type="dxa" w:w="100"/>
+          <w:bottom w:type="dxa" w:w="100"/>
+          <w:right w:type="dxa" w:w="100"/>
+        </w:tblCellMar>
+      </w:tblPr>
+      <w:tblGrid>
+        <w:gridCol w:w="100"/>
+        <w:gridCol w:w="100"/>
+        <w:gridCol w:w="100"/>
+      </w:tblGrid>
+      <w:tr>
+        <w:tc>
+          <w:tcPr>
+            <w:shd w:fill="7C3AED" w:color="7C3AED" w:val="solid"/>
+          </w:tcPr>
+          <w:p>
+            <w:r>
+              <w:rPr>
+                <w:rFonts w:ascii="Calibri" w:cs="Calibri" w:eastAsia="Calibri" w:hAnsi="Calibri"/>
+                <w:b/>
+                <w:bCs/>
+                <w:color w:val="FFFFFF"/>
+                <w:sz w:val="20"/>
+                <w:szCs w:val="20"/>
+              </w:rPr>
+              <w:t xml:space="preserve">Rota</w:t>
+            </w:r>
+          </w:p>
+        </w:tc>
+        <w:tc>
+          <w:tcPr>
+            <w:shd w:fill="7C3AED" w:color="7C3AED" w:val="solid"/>
+          </w:tcPr>
+          <w:p>
+            <w:r>
+              <w:rPr>
+                <w:rFonts w:ascii="Calibri" w:cs="Calibri" w:eastAsia="Calibri" w:hAnsi="Calibri"/>
+                <w:b/>
+                <w:bCs/>
+                <w:color w:val="FFFFFF"/>
+                <w:sz w:val="20"/>
+                <w:szCs w:val="20"/>
+              </w:rPr>
+              <w:t xml:space="preserve">Método</w:t>
+            </w:r>
+          </w:p>
+        </w:tc>
+        <w:tc>
+          <w:tcPr>
+            <w:shd w:fill="7C3AED" w:color="7C3AED" w:val="solid"/>
+          </w:tcPr>
+          <w:p>
+            <w:r>
+              <w:rPr>
+                <w:rFonts w:ascii="Calibri" w:cs="Calibri" w:eastAsia="Calibri" w:hAnsi="Calibri"/>
+                <w:b/>
+                <w:bCs/>
+                <w:color w:val="FFFFFF"/>
+                <w:sz w:val="20"/>
+                <w:szCs w:val="20"/>
+              </w:rPr>
+              <w:t xml:space="preserve">Descrição</w:t>
+            </w:r>
+          </w:p>
+        </w:tc>
+      </w:tr>
+      <w:tr>
+        <w:tc>
+          <w:tcPr>
+            <w:shd/>
+          </w:tcPr>
+          <w:p>
+            <w:r>
+              <w:rPr>
+                <w:rFonts w:ascii="Calibri" w:cs="Calibri" w:eastAsia="Calibri" w:hAnsi="Calibri"/>
+                <w:b w:val="false"/>
+                <w:bCs w:val="false"/>
+                <w:color w:val="1E293B"/>
+                <w:sz w:val="20"/>
+                <w:szCs w:val="20"/>
+              </w:rPr>
+              <w:t xml:space="preserve">`/api/push/subscribe`</w:t>
+            </w:r>
+          </w:p>
+        </w:tc>
+        <w:tc>
+          <w:tcPr>
+            <w:shd/>
+          </w:tcPr>
+          <w:p>
+            <w:r>
+              <w:rPr>
+                <w:rFonts w:ascii="Calibri" w:cs="Calibri" w:eastAsia="Calibri" w:hAnsi="Calibri"/>
+                <w:b w:val="false"/>
+                <w:bCs w:val="false"/>
+                <w:color w:val="1E293B"/>
+                <w:sz w:val="20"/>
+                <w:szCs w:val="20"/>
+              </w:rPr>
+              <w:t xml:space="preserve">POST</w:t>
+            </w:r>
+          </w:p>
+        </w:tc>
+        <w:tc>
+          <w:tcPr>
+            <w:shd/>
+          </w:tcPr>
+          <w:p>
+            <w:r>
+              <w:rPr>
+                <w:rFonts w:ascii="Calibri" w:cs="Calibri" w:eastAsia="Calibri" w:hAnsi="Calibri"/>
+                <w:b w:val="false"/>
+                <w:bCs w:val="false"/>
+                <w:color w:val="1E293B"/>
+                <w:sz w:val="20"/>
+                <w:szCs w:val="20"/>
+              </w:rPr>
+              <w:t xml:space="preserve">Salva subscription via upsert `onConflict: user_id,endpoint`</w:t>
+            </w:r>
+          </w:p>
+        </w:tc>
+      </w:tr>
+      <w:tr>
+        <w:tc>
+          <w:tcPr>
+            <w:shd w:fill="F1F5F9" w:color="F1F5F9" w:val="solid"/>
+          </w:tcPr>
+          <w:p>
+            <w:r>
+              <w:rPr>
+                <w:rFonts w:ascii="Calibri" w:cs="Calibri" w:eastAsia="Calibri" w:hAnsi="Calibri"/>
+                <w:b w:val="false"/>
+                <w:bCs w:val="false"/>
+                <w:color w:val="1E293B"/>
+                <w:sz w:val="20"/>
+                <w:szCs w:val="20"/>
+              </w:rPr>
+              <w:t xml:space="preserve">`/api/push/subscribe`</w:t>
+            </w:r>
+          </w:p>
+        </w:tc>
+        <w:tc>
+          <w:tcPr>
+            <w:shd w:fill="F1F5F9" w:color="F1F5F9" w:val="solid"/>
+          </w:tcPr>
+          <w:p>
+            <w:r>
+              <w:rPr>
+                <w:rFonts w:ascii="Calibri" w:cs="Calibri" w:eastAsia="Calibri" w:hAnsi="Calibri"/>
+                <w:b w:val="false"/>
+                <w:bCs w:val="false"/>
+                <w:color w:val="1E293B"/>
+                <w:sz w:val="20"/>
+                <w:szCs w:val="20"/>
+              </w:rPr>
+              <w:t xml:space="preserve">DELETE</w:t>
+            </w:r>
+          </w:p>
+        </w:tc>
+        <w:tc>
+          <w:tcPr>
+            <w:shd w:fill="F1F5F9" w:color="F1F5F9" w:val="solid"/>
+          </w:tcPr>
+          <w:p>
+            <w:r>
+              <w:rPr>
+                <w:rFonts w:ascii="Calibri" w:cs="Calibri" w:eastAsia="Calibri" w:hAnsi="Calibri"/>
+                <w:b w:val="false"/>
+                <w:bCs w:val="false"/>
+                <w:color w:val="1E293B"/>
+                <w:sz w:val="20"/>
+                <w:szCs w:val="20"/>
+              </w:rPr>
+              <w:t xml:space="preserve">Remove subscription por endpoint do usuário autenticado</w:t>
+            </w:r>
+          </w:p>
+        </w:tc>
+      </w:tr>
+      <w:tr>
+        <w:tc>
+          <w:tcPr>
+            <w:shd/>
+          </w:tcPr>
+          <w:p>
+            <w:r>
+              <w:rPr>
+                <w:rFonts w:ascii="Calibri" w:cs="Calibri" w:eastAsia="Calibri" w:hAnsi="Calibri"/>
+                <w:b w:val="false"/>
+                <w:bCs w:val="false"/>
+                <w:color w:val="1E293B"/>
+                <w:sz w:val="20"/>
+                <w:szCs w:val="20"/>
+              </w:rPr>
+              <w:t xml:space="preserve">`/api/push/notify`</w:t>
+            </w:r>
+          </w:p>
+        </w:tc>
+        <w:tc>
+          <w:tcPr>
+            <w:shd/>
+          </w:tcPr>
+          <w:p>
+            <w:r>
+              <w:rPr>
+                <w:rFonts w:ascii="Calibri" w:cs="Calibri" w:eastAsia="Calibri" w:hAnsi="Calibri"/>
+                <w:b w:val="false"/>
+                <w:bCs w:val="false"/>
+                <w:color w:val="1E293B"/>
+                <w:sz w:val="20"/>
+                <w:szCs w:val="20"/>
+              </w:rPr>
+              <w:t xml:space="preserve">POST</w:t>
+            </w:r>
+          </w:p>
+        </w:tc>
+        <w:tc>
+          <w:tcPr>
+            <w:shd/>
+          </w:tcPr>
+          <w:p>
+            <w:r>
+              <w:rPr>
+                <w:rFonts w:ascii="Calibri" w:cs="Calibri" w:eastAsia="Calibri" w:hAnsi="Calibri"/>
+                <w:b w:val="false"/>
+                <w:bCs w:val="false"/>
+                <w:color w:val="1E293B"/>
+                <w:sz w:val="20"/>
+                <w:szCs w:val="20"/>
+              </w:rPr>
+              <w:t xml:space="preserve">Envia push para todos os usuários com cards vencidos (protegido por `CRON_SECRET`)</w:t>
+            </w:r>
+          </w:p>
+        </w:tc>
+      </w:tr>
+    </w:tbl>
+    <w:p/>
+    <w:p>
+      <w:pPr>
+        <w:spacing w:after="80" w:before="80"/>
+      </w:pPr>
+    </w:p>
+    <w:p>
+      <w:pPr>
+        <w:spacing w:after="80" w:before="160"/>
+      </w:pPr>
+      <w:r>
+        <w:rPr>
+          <w:rFonts w:ascii="Calibri" w:cs="Calibri" w:eastAsia="Calibri" w:hAnsi="Calibri"/>
+          <w:b/>
+          <w:bCs/>
+          <w:color w:val="64748B"/>
+          <w:sz w:val="22"/>
+          <w:szCs w:val="22"/>
+        </w:rPr>
+        <w:t xml:space="preserve">Fluxo de envio (cron diário)</w:t>
+      </w:r>
+    </w:p>
+    <w:p>
+      <w:pPr>
+        <w:spacing w:after="80" w:before="80"/>
+      </w:pPr>
+    </w:p>
+    <w:p>
+      <w:pPr>
+        <w:spacing w:after="80" w:before="80"/>
+      </w:pPr>
+      <w:r>
+        <w:rPr>
+          <w:rFonts w:ascii="Calibri" w:cs="Calibri" w:eastAsia="Calibri" w:hAnsi="Calibri"/>
+          <w:color w:val="1E293B"/>
+          <w:sz w:val="22"/>
+          <w:szCs w:val="22"/>
+        </w:rPr>
+        <w:t xml:space="preserve">1. Buscar flashcards com </w:t>
+      </w:r>
+      <w:r>
+        <w:rPr>
+          <w:rFonts w:ascii="Courier New" w:cs="Courier New" w:eastAsia="Courier New" w:hAnsi="Courier New"/>
+          <w:color w:val="7C3AED"/>
+          <w:sz w:val="20"/>
+          <w:szCs w:val="20"/>
+        </w:rPr>
+        <w:t xml:space="preserve">next_review &lt;= hoje</w:t>
+      </w:r>
+    </w:p>
+    <w:p>
+      <w:pPr>
+        <w:spacing w:after="80" w:before="80"/>
+      </w:pPr>
+      <w:r>
+        <w:rPr>
+          <w:rFonts w:ascii="Calibri" w:cs="Calibri" w:eastAsia="Calibri" w:hAnsi="Calibri"/>
+          <w:color w:val="1E293B"/>
+          <w:sz w:val="22"/>
+          <w:szCs w:val="22"/>
+        </w:rPr>
+        <w:t xml:space="preserve">2. Agrupar por </w:t>
+      </w:r>
+      <w:r>
+        <w:rPr>
+          <w:rFonts w:ascii="Courier New" w:cs="Courier New" w:eastAsia="Courier New" w:hAnsi="Courier New"/>
+          <w:color w:val="7C3AED"/>
+          <w:sz w:val="20"/>
+          <w:szCs w:val="20"/>
+        </w:rPr>
+        <w:t xml:space="preserve">user_id</w:t>
+      </w:r>
+      <w:r>
+        <w:rPr>
+          <w:rFonts w:ascii="Calibri" w:cs="Calibri" w:eastAsia="Calibri" w:hAnsi="Calibri"/>
+          <w:color w:val="1E293B"/>
+          <w:sz w:val="22"/>
+          <w:szCs w:val="22"/>
+        </w:rPr>
+        <w:t xml:space="preserve"> (contagem)</w:t>
+      </w:r>
+    </w:p>
+    <w:p>
+      <w:pPr>
+        <w:spacing w:after="80" w:before="80"/>
+      </w:pPr>
+      <w:r>
+        <w:rPr>
+          <w:rFonts w:ascii="Calibri" w:cs="Calibri" w:eastAsia="Calibri" w:hAnsi="Calibri"/>
+          <w:color w:val="1E293B"/>
+          <w:sz w:val="22"/>
+          <w:szCs w:val="22"/>
+        </w:rPr>
+        <w:t xml:space="preserve">3. Buscar </w:t>
+      </w:r>
+      <w:r>
+        <w:rPr>
+          <w:rFonts w:ascii="Courier New" w:cs="Courier New" w:eastAsia="Courier New" w:hAnsi="Courier New"/>
+          <w:color w:val="7C3AED"/>
+          <w:sz w:val="20"/>
+          <w:szCs w:val="20"/>
+        </w:rPr>
+        <w:t xml:space="preserve">push_subscriptions</w:t>
+      </w:r>
+      <w:r>
+        <w:rPr>
+          <w:rFonts w:ascii="Calibri" w:cs="Calibri" w:eastAsia="Calibri" w:hAnsi="Calibri"/>
+          <w:color w:val="1E293B"/>
+          <w:sz w:val="22"/>
+          <w:szCs w:val="22"/>
+        </w:rPr>
+        <w:t xml:space="preserve"> dos usuários afetados</w:t>
+      </w:r>
+    </w:p>
+    <w:p>
+      <w:pPr>
+        <w:spacing w:after="80" w:before="80"/>
+      </w:pPr>
+      <w:r>
+        <w:rPr>
+          <w:rFonts w:ascii="Calibri" w:cs="Calibri" w:eastAsia="Calibri" w:hAnsi="Calibri"/>
+          <w:color w:val="1E293B"/>
+          <w:sz w:val="22"/>
+          <w:szCs w:val="22"/>
+        </w:rPr>
+        <w:t xml:space="preserve">4. Enviar via </w:t>
+      </w:r>
+      <w:r>
+        <w:rPr>
+          <w:rFonts w:ascii="Courier New" w:cs="Courier New" w:eastAsia="Courier New" w:hAnsi="Courier New"/>
+          <w:color w:val="7C3AED"/>
+          <w:sz w:val="20"/>
+          <w:szCs w:val="20"/>
+        </w:rPr>
+        <w:t xml:space="preserve">webpush.sendNotification()</w:t>
+      </w:r>
+      <w:r>
+        <w:rPr>
+          <w:rFonts w:ascii="Calibri" w:cs="Calibri" w:eastAsia="Calibri" w:hAnsi="Calibri"/>
+          <w:color w:val="1E293B"/>
+          <w:sz w:val="22"/>
+          <w:szCs w:val="22"/>
+        </w:rPr>
+        <w:t xml:space="preserve"> para cada endpoint</w:t>
+      </w:r>
+    </w:p>
+    <w:p>
+      <w:pPr>
+        <w:spacing w:after="80" w:before="80"/>
+      </w:pPr>
+      <w:r>
+        <w:rPr>
+          <w:rFonts w:ascii="Calibri" w:cs="Calibri" w:eastAsia="Calibri" w:hAnsi="Calibri"/>
+          <w:color w:val="1E293B"/>
+          <w:sz w:val="22"/>
+          <w:szCs w:val="22"/>
+        </w:rPr>
+        <w:t xml:space="preserve">5. Remover subscriptions com HTTP 410 (expiradas)</w:t>
+      </w:r>
+    </w:p>
+    <w:p>
+      <w:pPr>
+        <w:spacing w:after="80" w:before="80"/>
+      </w:pPr>
+    </w:p>
+    <w:p>
+      <w:pPr>
+        <w:spacing w:after="80" w:before="160"/>
+      </w:pPr>
+      <w:r>
+        <w:rPr>
+          <w:rFonts w:ascii="Calibri" w:cs="Calibri" w:eastAsia="Calibri" w:hAnsi="Calibri"/>
+          <w:b/>
+          <w:bCs/>
+          <w:color w:val="64748B"/>
+          <w:sz w:val="22"/>
+          <w:szCs w:val="22"/>
+        </w:rPr>
+        <w:t xml:space="preserve">Variáveis de Ambiente</w:t>
+      </w:r>
+    </w:p>
+    <w:p>
+      <w:pPr>
+        <w:spacing w:after="80" w:before="80"/>
+      </w:pPr>
+    </w:p>
+    <w:tbl>
+      <w:tblPr>
+        <w:tblW w:type="pct" w:w="100%"/>
+        <w:tblBorders>
+          <w:top w:val="single" w:color="auto" w:sz="4"/>
+          <w:left w:val="single" w:color="auto" w:sz="4"/>
+          <w:bottom w:val="single" w:color="auto" w:sz="4"/>
+          <w:right w:val="single" w:color="auto" w:sz="4"/>
+          <w:insideH w:val="single" w:color="auto" w:sz="4"/>
+          <w:insideV w:val="single" w:color="auto" w:sz="4"/>
+        </w:tblBorders>
+        <w:tblCellMar>
+          <w:top w:type="dxa" w:w="100"/>
+          <w:left w:type="dxa" w:w="100"/>
+          <w:bottom w:type="dxa" w:w="100"/>
+          <w:right w:type="dxa" w:w="100"/>
+        </w:tblCellMar>
+      </w:tblPr>
+      <w:tblGrid>
+        <w:gridCol w:w="100"/>
+        <w:gridCol w:w="100"/>
+        <w:gridCol w:w="100"/>
+      </w:tblGrid>
+      <w:tr>
+        <w:tc>
+          <w:tcPr>
+            <w:shd w:fill="7C3AED" w:color="7C3AED" w:val="solid"/>
+          </w:tcPr>
+          <w:p>
+            <w:r>
+              <w:rPr>
+                <w:rFonts w:ascii="Calibri" w:cs="Calibri" w:eastAsia="Calibri" w:hAnsi="Calibri"/>
+                <w:b/>
+                <w:bCs/>
+                <w:color w:val="FFFFFF"/>
+                <w:sz w:val="20"/>
+                <w:szCs w:val="20"/>
+              </w:rPr>
+              <w:t xml:space="preserve">Variável</w:t>
+            </w:r>
+          </w:p>
+        </w:tc>
+        <w:tc>
+          <w:tcPr>
+            <w:shd w:fill="7C3AED" w:color="7C3AED" w:val="solid"/>
+          </w:tcPr>
+          <w:p>
+            <w:r>
+              <w:rPr>
+                <w:rFonts w:ascii="Calibri" w:cs="Calibri" w:eastAsia="Calibri" w:hAnsi="Calibri"/>
+                <w:b/>
+                <w:bCs/>
+                <w:color w:val="FFFFFF"/>
+                <w:sz w:val="20"/>
+                <w:szCs w:val="20"/>
+              </w:rPr>
+              <w:t xml:space="preserve">Exposição</w:t>
+            </w:r>
+          </w:p>
+        </w:tc>
+        <w:tc>
+          <w:tcPr>
+            <w:shd w:fill="7C3AED" w:color="7C3AED" w:val="solid"/>
+          </w:tcPr>
+          <w:p>
+            <w:r>
+              <w:rPr>
+                <w:rFonts w:ascii="Calibri" w:cs="Calibri" w:eastAsia="Calibri" w:hAnsi="Calibri"/>
+                <w:b/>
+                <w:bCs/>
+                <w:color w:val="FFFFFF"/>
+                <w:sz w:val="20"/>
+                <w:szCs w:val="20"/>
+              </w:rPr>
+              <w:t xml:space="preserve">Descrição</w:t>
+            </w:r>
+          </w:p>
+        </w:tc>
+      </w:tr>
+      <w:tr>
+        <w:tc>
+          <w:tcPr>
+            <w:shd/>
+          </w:tcPr>
+          <w:p>
+            <w:r>
+              <w:rPr>
+                <w:rFonts w:ascii="Calibri" w:cs="Calibri" w:eastAsia="Calibri" w:hAnsi="Calibri"/>
+                <w:b w:val="false"/>
+                <w:bCs w:val="false"/>
+                <w:color w:val="1E293B"/>
+                <w:sz w:val="20"/>
+                <w:szCs w:val="20"/>
+              </w:rPr>
+              <w:t xml:space="preserve">`NEXT_PUBLIC_VAPID_PUBLIC_KEY`</w:t>
+            </w:r>
+          </w:p>
+        </w:tc>
+        <w:tc>
+          <w:tcPr>
+            <w:shd/>
+          </w:tcPr>
+          <w:p>
+            <w:r>
+              <w:rPr>
+                <w:rFonts w:ascii="Calibri" w:cs="Calibri" w:eastAsia="Calibri" w:hAnsi="Calibri"/>
+                <w:b w:val="false"/>
+                <w:bCs w:val="false"/>
+                <w:color w:val="1E293B"/>
+                <w:sz w:val="20"/>
+                <w:szCs w:val="20"/>
+              </w:rPr>
+              <w:t xml:space="preserve">Pública (browser)</w:t>
+            </w:r>
+          </w:p>
+        </w:tc>
+        <w:tc>
+          <w:tcPr>
+            <w:shd/>
+          </w:tcPr>
+          <w:p>
+            <w:r>
+              <w:rPr>
+                <w:rFonts w:ascii="Calibri" w:cs="Calibri" w:eastAsia="Calibri" w:hAnsi="Calibri"/>
+                <w:b w:val="false"/>
+                <w:bCs w:val="false"/>
+                <w:color w:val="1E293B"/>
+                <w:sz w:val="20"/>
+                <w:szCs w:val="20"/>
+              </w:rPr>
+              <w:t xml:space="preserve">Chave VAPID pública — usada no `pushManager.subscribe()`</w:t>
+            </w:r>
+          </w:p>
+        </w:tc>
+      </w:tr>
+      <w:tr>
+        <w:tc>
+          <w:tcPr>
+            <w:shd w:fill="F1F5F9" w:color="F1F5F9" w:val="solid"/>
+          </w:tcPr>
+          <w:p>
+            <w:r>
+              <w:rPr>
+                <w:rFonts w:ascii="Calibri" w:cs="Calibri" w:eastAsia="Calibri" w:hAnsi="Calibri"/>
+                <w:b w:val="false"/>
+                <w:bCs w:val="false"/>
+                <w:color w:val="1E293B"/>
+                <w:sz w:val="20"/>
+                <w:szCs w:val="20"/>
+              </w:rPr>
+              <w:t xml:space="preserve">`VAPID_PRIVATE_KEY`</w:t>
+            </w:r>
+          </w:p>
+        </w:tc>
+        <w:tc>
+          <w:tcPr>
+            <w:shd w:fill="F1F5F9" w:color="F1F5F9" w:val="solid"/>
+          </w:tcPr>
+          <w:p>
+            <w:r>
+              <w:rPr>
+                <w:rFonts w:ascii="Calibri" w:cs="Calibri" w:eastAsia="Calibri" w:hAnsi="Calibri"/>
+                <w:b w:val="false"/>
+                <w:bCs w:val="false"/>
+                <w:color w:val="1E293B"/>
+                <w:sz w:val="20"/>
+                <w:szCs w:val="20"/>
+              </w:rPr>
+              <w:t xml:space="preserve">Servidor only</w:t>
+            </w:r>
+          </w:p>
+        </w:tc>
+        <w:tc>
+          <w:tcPr>
+            <w:shd w:fill="F1F5F9" w:color="F1F5F9" w:val="solid"/>
+          </w:tcPr>
+          <w:p>
+            <w:r>
+              <w:rPr>
+                <w:rFonts w:ascii="Calibri" w:cs="Calibri" w:eastAsia="Calibri" w:hAnsi="Calibri"/>
+                <w:b w:val="false"/>
+                <w:bCs w:val="false"/>
+                <w:color w:val="1E293B"/>
+                <w:sz w:val="20"/>
+                <w:szCs w:val="20"/>
+              </w:rPr>
+              <w:t xml:space="preserve">Chave VAPID privada — usada no `web-push.setVapidDetails()`</w:t>
+            </w:r>
+          </w:p>
+        </w:tc>
+      </w:tr>
+      <w:tr>
+        <w:tc>
+          <w:tcPr>
+            <w:shd/>
+          </w:tcPr>
+          <w:p>
+            <w:r>
+              <w:rPr>
+                <w:rFonts w:ascii="Calibri" w:cs="Calibri" w:eastAsia="Calibri" w:hAnsi="Calibri"/>
+                <w:b w:val="false"/>
+                <w:bCs w:val="false"/>
+                <w:color w:val="1E293B"/>
+                <w:sz w:val="20"/>
+                <w:szCs w:val="20"/>
+              </w:rPr>
+              <w:t xml:space="preserve">`VAPID_EMAIL`</w:t>
+            </w:r>
+          </w:p>
+        </w:tc>
+        <w:tc>
+          <w:tcPr>
+            <w:shd/>
+          </w:tcPr>
+          <w:p>
+            <w:r>
+              <w:rPr>
+                <w:rFonts w:ascii="Calibri" w:cs="Calibri" w:eastAsia="Calibri" w:hAnsi="Calibri"/>
+                <w:b w:val="false"/>
+                <w:bCs w:val="false"/>
+                <w:color w:val="1E293B"/>
+                <w:sz w:val="20"/>
+                <w:szCs w:val="20"/>
+              </w:rPr>
+              <w:t xml:space="preserve">Servidor only</w:t>
+            </w:r>
+          </w:p>
+        </w:tc>
+        <w:tc>
+          <w:tcPr>
+            <w:shd/>
+          </w:tcPr>
+          <w:p>
+            <w:r>
+              <w:rPr>
+                <w:rFonts w:ascii="Calibri" w:cs="Calibri" w:eastAsia="Calibri" w:hAnsi="Calibri"/>
+                <w:b w:val="false"/>
+                <w:bCs w:val="false"/>
+                <w:color w:val="1E293B"/>
+                <w:sz w:val="20"/>
+                <w:szCs w:val="20"/>
+              </w:rPr>
+              <w:t xml:space="preserve">Email de contato para o protocolo VAPID</w:t>
+            </w:r>
+          </w:p>
+        </w:tc>
+      </w:tr>
+      <w:tr>
+        <w:tc>
+          <w:tcPr>
+            <w:shd w:fill="F1F5F9" w:color="F1F5F9" w:val="solid"/>
+          </w:tcPr>
+          <w:p>
+            <w:r>
+              <w:rPr>
+                <w:rFonts w:ascii="Calibri" w:cs="Calibri" w:eastAsia="Calibri" w:hAnsi="Calibri"/>
+                <w:b w:val="false"/>
+                <w:bCs w:val="false"/>
+                <w:color w:val="1E293B"/>
+                <w:sz w:val="20"/>
+                <w:szCs w:val="20"/>
+              </w:rPr>
+              <w:t xml:space="preserve">`CRON_SECRET`</w:t>
+            </w:r>
+          </w:p>
+        </w:tc>
+        <w:tc>
+          <w:tcPr>
+            <w:shd w:fill="F1F5F9" w:color="F1F5F9" w:val="solid"/>
+          </w:tcPr>
+          <w:p>
+            <w:r>
+              <w:rPr>
+                <w:rFonts w:ascii="Calibri" w:cs="Calibri" w:eastAsia="Calibri" w:hAnsi="Calibri"/>
+                <w:b w:val="false"/>
+                <w:bCs w:val="false"/>
+                <w:color w:val="1E293B"/>
+                <w:sz w:val="20"/>
+                <w:szCs w:val="20"/>
+              </w:rPr>
+              <w:t xml:space="preserve">Servidor only</w:t>
+            </w:r>
+          </w:p>
+        </w:tc>
+        <w:tc>
+          <w:tcPr>
+            <w:shd w:fill="F1F5F9" w:color="F1F5F9" w:val="solid"/>
+          </w:tcPr>
+          <w:p>
+            <w:r>
+              <w:rPr>
+                <w:rFonts w:ascii="Calibri" w:cs="Calibri" w:eastAsia="Calibri" w:hAnsi="Calibri"/>
+                <w:b w:val="false"/>
+                <w:bCs w:val="false"/>
+                <w:color w:val="1E293B"/>
+                <w:sz w:val="20"/>
+                <w:szCs w:val="20"/>
+              </w:rPr>
+              <w:t xml:space="preserve">Token para proteger `POST /api/push/notify`</w:t>
+            </w:r>
+          </w:p>
+        </w:tc>
+      </w:tr>
+    </w:tbl>
+    <w:p/>
+    <w:p>
+      <w:pPr>
+        <w:spacing w:after="80" w:before="80"/>
+      </w:pPr>
+    </w:p>
+    <w:p>
+      <w:pPr>
+        <w:pStyle w:val="Heading3"/>
+        <w:spacing w:after="120" w:before="240"/>
+      </w:pPr>
+      <w:r>
+        <w:rPr>
+          <w:rFonts w:ascii="Calibri" w:cs="Calibri" w:eastAsia="Calibri" w:hAnsi="Calibri"/>
+          <w:b/>
+          <w:bCs/>
+          <w:color w:val="1E293B"/>
+          <w:sz w:val="24"/>
+          <w:szCs w:val="24"/>
+        </w:rPr>
+        <w:t xml:space="preserve">Hook `usePushNotifications`</w:t>
+      </w:r>
+    </w:p>
+    <w:p>
+      <w:pPr>
+        <w:spacing w:after="80" w:before="80"/>
+      </w:pPr>
+    </w:p>
+    <w:p>
+      <w:pPr>
+        <w:shd w:fill="F1F5F9" w:color="F1F5F9" w:val="solid"/>
+        <w:spacing w:after="200" w:before="200"/>
+        <w:ind w:left="431"/>
+      </w:pPr>
+      <w:r>
+        <w:rPr>
+          <w:rFonts w:ascii="Courier New" w:cs="Courier New" w:eastAsia="Courier New" w:hAnsi="Courier New"/>
+          <w:color w:val="1E293B"/>
+          <w:sz w:val="18"/>
+          <w:szCs w:val="18"/>
+        </w:rPr>
+        <w:t xml:space="preserve">// src/hooks/usePushNotifications.ts
+export function usePushNotifications(): {
+  permission: 'default' | 'granted' | 'denied' | 'unsupported'
+  isSubscribed: boolean
+  loading: boolean
+  subscribe(): Promise&lt;boolean&gt;
+  unsubscribe(): Promise&lt;void&gt;
+}</w:t>
+      </w:r>
+    </w:p>
+    <w:p>
+      <w:pPr>
+        <w:spacing w:after="80" w:before="80"/>
+      </w:pPr>
+    </w:p>
+    <w:p>
+      <w:pPr>
+        <w:pStyle w:val="Heading3"/>
+        <w:spacing w:after="120" w:before="240"/>
+      </w:pPr>
+      <w:r>
+        <w:rPr>
+          <w:rFonts w:ascii="Calibri" w:cs="Calibri" w:eastAsia="Calibri" w:hAnsi="Calibri"/>
+          <w:b/>
+          <w:bCs/>
+          <w:color w:val="1E293B"/>
+          <w:sz w:val="24"/>
+          <w:szCs w:val="24"/>
+        </w:rPr>
+        <w:t xml:space="preserve">Componentes</w:t>
+      </w:r>
+    </w:p>
+    <w:p>
+      <w:pPr>
+        <w:spacing w:after="80" w:before="80"/>
+      </w:pPr>
+    </w:p>
+    <w:p>
+      <w:pPr>
+        <w:pStyle w:val="ListParagraph"/>
+        <w:numPr>
+          <w:ilvl w:val="0"/>
+          <w:numId w:val="1"/>
+        </w:numPr>
+        <w:spacing w:after="60" w:before="60"/>
+        <w:ind w:left="431"/>
+      </w:pPr>
+      <w:r>
+        <w:rPr>
+          <w:rFonts w:ascii="Calibri" w:cs="Calibri" w:eastAsia="Calibri" w:hAnsi="Calibri"/>
+          <w:b/>
+          <w:bCs/>
+          <w:color w:val="1E293B"/>
+          <w:sz w:val="22"/>
+          <w:szCs w:val="22"/>
+        </w:rPr>
+        <w:t xml:space="preserve">`ServiceWorkerRegistrar`</w:t>
+      </w:r>
+      <w:r>
+        <w:rPr>
+          <w:rFonts w:ascii="Calibri" w:cs="Calibri" w:eastAsia="Calibri" w:hAnsi="Calibri"/>
+          <w:color w:val="1E293B"/>
+          <w:sz w:val="22"/>
+          <w:szCs w:val="22"/>
+        </w:rPr>
+        <w:t xml:space="preserve"> — Client Component que registra </w:t>
+      </w:r>
+      <w:r>
+        <w:rPr>
+          <w:rFonts w:ascii="Courier New" w:cs="Courier New" w:eastAsia="Courier New" w:hAnsi="Courier New"/>
+          <w:color w:val="7C3AED"/>
+          <w:sz w:val="20"/>
+          <w:szCs w:val="20"/>
+        </w:rPr>
+        <w:t xml:space="preserve">/sw.js</w:t>
+      </w:r>
+      <w:r>
+        <w:rPr>
+          <w:rFonts w:ascii="Calibri" w:cs="Calibri" w:eastAsia="Calibri" w:hAnsi="Calibri"/>
+          <w:color w:val="1E293B"/>
+          <w:sz w:val="22"/>
+          <w:szCs w:val="22"/>
+        </w:rPr>
+        <w:t xml:space="preserve"> uma única vez após mount. Renderiza </w:t>
+      </w:r>
+      <w:r>
+        <w:rPr>
+          <w:rFonts w:ascii="Courier New" w:cs="Courier New" w:eastAsia="Courier New" w:hAnsi="Courier New"/>
+          <w:color w:val="7C3AED"/>
+          <w:sz w:val="20"/>
+          <w:szCs w:val="20"/>
+        </w:rPr>
+        <w:t xml:space="preserve">null</w:t>
+      </w:r>
+      <w:r>
+        <w:rPr>
+          <w:rFonts w:ascii="Calibri" w:cs="Calibri" w:eastAsia="Calibri" w:hAnsi="Calibri"/>
+          <w:color w:val="1E293B"/>
+          <w:sz w:val="22"/>
+          <w:szCs w:val="22"/>
+        </w:rPr>
+        <w:t xml:space="preserve">.</w:t>
+      </w:r>
+    </w:p>
+    <w:p>
+      <w:pPr>
+        <w:pStyle w:val="ListParagraph"/>
+        <w:numPr>
+          <w:ilvl w:val="0"/>
+          <w:numId w:val="1"/>
+        </w:numPr>
+        <w:spacing w:after="60" w:before="60"/>
+        <w:ind w:left="431"/>
+      </w:pPr>
+      <w:r>
+        <w:rPr>
+          <w:rFonts w:ascii="Calibri" w:cs="Calibri" w:eastAsia="Calibri" w:hAnsi="Calibri"/>
+          <w:b/>
+          <w:bCs/>
+          <w:color w:val="1E293B"/>
+          <w:sz w:val="22"/>
+          <w:szCs w:val="22"/>
+        </w:rPr>
+        <w:t xml:space="preserve">`PushNotificationPrompt`</w:t>
+      </w:r>
+      <w:r>
+        <w:rPr>
+          <w:rFonts w:ascii="Calibri" w:cs="Calibri" w:eastAsia="Calibri" w:hAnsi="Calibri"/>
+          <w:color w:val="1E293B"/>
+          <w:sz w:val="22"/>
+          <w:szCs w:val="22"/>
+        </w:rPr>
+        <w:t xml:space="preserve"> — Banner fixo (bottom-center) que aparece 3s após mount se: permissão não negada, não subscrito, não dispensado (</w:t>
+      </w:r>
+      <w:r>
+        <w:rPr>
+          <w:rFonts w:ascii="Courier New" w:cs="Courier New" w:eastAsia="Courier New" w:hAnsi="Courier New"/>
+          <w:color w:val="7C3AED"/>
+          <w:sz w:val="20"/>
+          <w:szCs w:val="20"/>
+        </w:rPr>
+        <w:t xml:space="preserve">localStorage nl_push_dismissed</w:t>
+      </w:r>
+      <w:r>
+        <w:rPr>
+          <w:rFonts w:ascii="Calibri" w:cs="Calibri" w:eastAsia="Calibri" w:hAnsi="Calibri"/>
+          <w:color w:val="1E293B"/>
+          <w:sz w:val="22"/>
+          <w:szCs w:val="22"/>
+        </w:rPr>
+        <w:t xml:space="preserve">).</w:t>
+      </w:r>
+    </w:p>
+    <w:p>
+      <w:pPr>
+        <w:spacing w:after="80" w:before="80"/>
+      </w:pPr>
+    </w:p>
+    <w:p>
+      <w:pPr>
+        <w:spacing w:after="80" w:before="80"/>
+      </w:pPr>
+      <w:r>
+        <w:rPr>
+          <w:rFonts w:ascii="Calibri" w:cs="Calibri" w:eastAsia="Calibri" w:hAnsi="Calibri"/>
+          <w:color w:val="1E293B"/>
+          <w:sz w:val="22"/>
+          <w:szCs w:val="22"/>
+        </w:rPr>
+        <w:t xml:space="preserve">Ambos adicionados ao </w:t>
+      </w:r>
+      <w:r>
+        <w:rPr>
+          <w:rFonts w:ascii="Courier New" w:cs="Courier New" w:eastAsia="Courier New" w:hAnsi="Courier New"/>
+          <w:color w:val="7C3AED"/>
+          <w:sz w:val="20"/>
+          <w:szCs w:val="20"/>
+        </w:rPr>
+        <w:t xml:space="preserve">AppShell.tsx</w:t>
+      </w:r>
+      <w:r>
+        <w:rPr>
+          <w:rFonts w:ascii="Calibri" w:cs="Calibri" w:eastAsia="Calibri" w:hAnsi="Calibri"/>
+          <w:color w:val="1E293B"/>
+          <w:sz w:val="22"/>
+          <w:szCs w:val="22"/>
+        </w:rPr>
+        <w:t xml:space="preserve"> após </w:t>
+      </w:r>
+      <w:r>
+        <w:rPr>
+          <w:rFonts w:ascii="Courier New" w:cs="Courier New" w:eastAsia="Courier New" w:hAnsi="Courier New"/>
+          <w:color w:val="7C3AED"/>
+          <w:sz w:val="20"/>
+          <w:szCs w:val="20"/>
+        </w:rPr>
+        <w:t xml:space="preserve">&lt;AnalyticsIdentifier /&gt;</w:t>
+      </w:r>
+      <w:r>
+        <w:rPr>
+          <w:rFonts w:ascii="Calibri" w:cs="Calibri" w:eastAsia="Calibri" w:hAnsi="Calibri"/>
+          <w:color w:val="1E293B"/>
+          <w:sz w:val="22"/>
+          <w:szCs w:val="22"/>
+        </w:rPr>
+        <w:t xml:space="preserve">.</w:t>
+      </w:r>
+    </w:p>
+    <w:p>
+      <w:pPr>
+        <w:spacing w:after="80" w:before="80"/>
+      </w:pPr>
+    </w:p>
+    <w:p>
+      <w:pPr>
+        <w:pStyle w:val="Heading3"/>
+        <w:spacing w:after="120" w:before="240"/>
+      </w:pPr>
+      <w:r>
+        <w:rPr>
+          <w:rFonts w:ascii="Calibri" w:cs="Calibri" w:eastAsia="Calibri" w:hAnsi="Calibri"/>
+          <w:b/>
+          <w:bCs/>
+          <w:color w:val="1E293B"/>
+          <w:sz w:val="24"/>
+          <w:szCs w:val="24"/>
+        </w:rPr>
+        <w:t xml:space="preserve">Geração de Ícones</w:t>
+      </w:r>
+    </w:p>
+    <w:p>
+      <w:pPr>
+        <w:spacing w:after="80" w:before="80"/>
+      </w:pPr>
+    </w:p>
+    <w:p>
+      <w:pPr>
+        <w:shd w:fill="F1F5F9" w:color="F1F5F9" w:val="solid"/>
+        <w:spacing w:after="200" w:before="200"/>
+        <w:ind w:left="431"/>
+      </w:pPr>
+      <w:r>
+        <w:rPr>
+          <w:rFonts w:ascii="Courier New" w:cs="Courier New" w:eastAsia="Courier New" w:hAnsi="Courier New"/>
+          <w:color w:val="1E293B"/>
+          <w:sz w:val="18"/>
+          <w:szCs w:val="18"/>
+        </w:rPr>
+        <w:t xml:space="preserve">node scripts/generate-icons.js</w:t>
+      </w:r>
+    </w:p>
+    <w:p>
+      <w:pPr>
+        <w:spacing w:after="80" w:before="80"/>
+      </w:pPr>
+    </w:p>
+    <w:p>
+      <w:pPr>
+        <w:spacing w:after="80" w:before="80"/>
+      </w:pPr>
+      <w:r>
+        <w:rPr>
+          <w:rFonts w:ascii="Calibri" w:cs="Calibri" w:eastAsia="Calibri" w:hAnsi="Calibri"/>
+          <w:color w:val="1E293B"/>
+          <w:sz w:val="22"/>
+          <w:szCs w:val="22"/>
+        </w:rPr>
+        <w:t xml:space="preserve">Gera os 4 ícones PNG em </w:t>
+      </w:r>
+      <w:r>
+        <w:rPr>
+          <w:rFonts w:ascii="Courier New" w:cs="Courier New" w:eastAsia="Courier New" w:hAnsi="Courier New"/>
+          <w:color w:val="7C3AED"/>
+          <w:sz w:val="20"/>
+          <w:szCs w:val="20"/>
+        </w:rPr>
+        <w:t xml:space="preserve">public/icons/</w:t>
+      </w:r>
+      <w:r>
+        <w:rPr>
+          <w:rFonts w:ascii="Calibri" w:cs="Calibri" w:eastAsia="Calibri" w:hAnsi="Calibri"/>
+          <w:color w:val="1E293B"/>
+          <w:sz w:val="22"/>
+          <w:szCs w:val="22"/>
+        </w:rPr>
+        <w:t xml:space="preserve"> usando apenas módulos nativos do Node.js (</w:t>
+      </w:r>
+      <w:r>
+        <w:rPr>
+          <w:rFonts w:ascii="Courier New" w:cs="Courier New" w:eastAsia="Courier New" w:hAnsi="Courier New"/>
+          <w:color w:val="7C3AED"/>
+          <w:sz w:val="20"/>
+          <w:szCs w:val="20"/>
+        </w:rPr>
+        <w:t xml:space="preserve">zlib</w:t>
+      </w:r>
+      <w:r>
+        <w:rPr>
+          <w:rFonts w:ascii="Calibri" w:cs="Calibri" w:eastAsia="Calibri" w:hAnsi="Calibri"/>
+          <w:color w:val="1E293B"/>
+          <w:sz w:val="22"/>
+          <w:szCs w:val="22"/>
+        </w:rPr>
+        <w:t xml:space="preserve">, </w:t>
+      </w:r>
+      <w:r>
+        <w:rPr>
+          <w:rFonts w:ascii="Courier New" w:cs="Courier New" w:eastAsia="Courier New" w:hAnsi="Courier New"/>
+          <w:color w:val="7C3AED"/>
+          <w:sz w:val="20"/>
+          <w:szCs w:val="20"/>
+        </w:rPr>
+        <w:t xml:space="preserve">fs</w:t>
+      </w:r>
+      <w:r>
+        <w:rPr>
+          <w:rFonts w:ascii="Calibri" w:cs="Calibri" w:eastAsia="Calibri" w:hAnsi="Calibri"/>
+          <w:color w:val="1E293B"/>
+          <w:sz w:val="22"/>
+          <w:szCs w:val="22"/>
+        </w:rPr>
+        <w:t xml:space="preserve">, </w:t>
+      </w:r>
+      <w:r>
+        <w:rPr>
+          <w:rFonts w:ascii="Courier New" w:cs="Courier New" w:eastAsia="Courier New" w:hAnsi="Courier New"/>
+          <w:color w:val="7C3AED"/>
+          <w:sz w:val="20"/>
+          <w:szCs w:val="20"/>
+        </w:rPr>
+        <w:t xml:space="preserve">path</w:t>
+      </w:r>
+      <w:r>
+        <w:rPr>
+          <w:rFonts w:ascii="Calibri" w:cs="Calibri" w:eastAsia="Calibri" w:hAnsi="Calibri"/>
+          <w:color w:val="1E293B"/>
+          <w:sz w:val="22"/>
+          <w:szCs w:val="22"/>
+        </w:rPr>
+        <w:t xml:space="preserve">). Não é necessário rodar em CI — os ícones estão commitados.</w:t>
       </w:r>
     </w:p>
     <w:p>

</xml_diff>